<commit_message>
renomeia quantidadeBanheiros e quantidadeQuartos no modelo do banco de dados. Issue #23
</commit_message>
<xml_diff>
--- a/Gerenciamento/DocumentoPadraoCodificacaoBD-ImovelJa.docx
+++ b/Gerenciamento/DocumentoPadraoCodificacaoBD-ImovelJa.docx
@@ -2902,47 +2902,6 @@
           </w:p>
         </w:tc>
       </w:tr>
-      <w:tr>
-        <w:tc>
-          <w:tcPr>
-            <w:tcW w:w="1600" w:type="dxa"/>
-          </w:tcPr>
-          <w:p>
-            <w:pPr>
-              <w:spacing w:before="40" w:after="40"/>
-            </w:pPr>
-            <w:r>
-              <w:t xml:space="preserve">n</w:t>
-            </w:r>
-          </w:p>
-        </w:tc>
-        <w:tc>
-          <w:tcPr>
-            <w:tcW w:w="4000" w:type="dxa"/>
-          </w:tcPr>
-          <w:p>
-            <w:pPr>
-              <w:spacing w:before="40" w:after="40"/>
-            </w:pPr>
-            <w:r>
-              <w:t xml:space="preserve">Número/quantidade de</w:t>
-            </w:r>
-          </w:p>
-        </w:tc>
-        <w:tc>
-          <w:tcPr>
-            <w:tcW w:w="2800" w:type="dxa"/>
-          </w:tcPr>
-          <w:p>
-            <w:pPr>
-              <w:spacing w:before="40" w:after="40"/>
-            </w:pPr>
-            <w:r>
-              <w:t xml:space="preserve">nQuartos, nBanheiros</w:t>
-            </w:r>
-          </w:p>
-        </w:tc>
-      </w:tr>
     </w:tbl>
     <w:p/>
     <w:p>
@@ -3022,6 +2981,15 @@
         <w:t xml:space="preserve">valorPago</w:t>
       </w:r>
     </w:p>
+    <w:p>
+      <w:pPr>
+        <w:ind w:firstLine="709"/>
+        <w:jc w:val="both"/>
+      </w:pPr>
+      <w:r>
+        <w:t xml:space="preserve">quantidadeQuartos</w:t>
+      </w:r>
+    </w:p>
     <w:p/>
     <w:p>
       <w:pPr>
@@ -3069,15 +3037,6 @@
       </w:pPr>
       <w:r>
         <w:t xml:space="preserve">cep</w:t>
-      </w:r>
-    </w:p>
-    <w:p>
-      <w:pPr>
-        <w:ind w:firstLine="709"/>
-        <w:jc w:val="both"/>
-      </w:pPr>
-      <w:r>
-        <w:t xml:space="preserve">nQuartos</w:t>
       </w:r>
     </w:p>
     <w:p/>

</xml_diff>

<commit_message>
adiciona a versão 1.1 ao histórico do padrão de nomenclatura do banco de dados. Issue #23
</commit_message>
<xml_diff>
--- a/Gerenciamento/DocumentoPadraoCodificacaoBD-ImovelJa.docx
+++ b/Gerenciamento/DocumentoPadraoCodificacaoBD-ImovelJa.docx
@@ -112,7 +112,7 @@
           <w:sz w:val="28"/>
           <w:szCs w:val="28"/>
         </w:rPr>
-        <w:t>Versão 1.0</w:t>
+        <w:t>Versão 1.1</w:t>
       </w:r>
     </w:p>
     <w:p>
@@ -574,6 +574,12 @@
                 <w:sz w:val="22"/>
               </w:rPr>
             </w:pPr>
+            <w:r>
+              <w:rPr>
+                <w:sz w:val="22"/>
+              </w:rPr>
+              <w:t>12/10/2026</w:t>
+            </w:r>
           </w:p>
         </w:tc>
         <w:tc>
@@ -588,6 +594,12 @@
                 <w:sz w:val="22"/>
               </w:rPr>
             </w:pPr>
+            <w:r>
+              <w:rPr>
+                <w:sz w:val="22"/>
+              </w:rPr>
+              <w:t>1.1</w:t>
+            </w:r>
           </w:p>
         </w:tc>
         <w:tc>
@@ -602,6 +614,12 @@
                 <w:sz w:val="22"/>
               </w:rPr>
             </w:pPr>
+            <w:r>
+              <w:rPr>
+                <w:sz w:val="22"/>
+              </w:rPr>
+              <w:t>Remoção da abreviação n e adoção de nomes descritivos para atributos de quantidade.</w:t>
+            </w:r>
           </w:p>
         </w:tc>
         <w:tc>
@@ -616,6 +634,12 @@
                 <w:sz w:val="22"/>
               </w:rPr>
             </w:pPr>
+            <w:r>
+              <w:rPr>
+                <w:sz w:val="22"/>
+              </w:rPr>
+              <w:t>Igor Dias</w:t>
+            </w:r>
           </w:p>
         </w:tc>
       </w:tr>

</xml_diff>